<commit_message>
Synchronize v13 with recent safety research and verified frontier controls
</commit_message>
<xml_diff>
--- a/fssai-ra/paper/tbc-v13/TBC_v13_Frontier_Threat_Revision.docx
+++ b/fssai-ra/paper/tbc-v13/TBC_v13_Frontier_Threat_Revision.docx
@@ -76,7 +76,7 @@
     </w:p>
     <w:p>
       <w:r>
-        <w:t xml:space="preserve">Generative AI is moving from conversational assistance to agentic operation: systems retrieve institutional data, invoke tools, execute code, retain memory, delegate to subordinate agents, and act across digital environments. The assurance question is therefore no longer whether a model gives a correct answer, but what a model can cause when it is wrong, manipulated, or pursuing an objective it does not disclose. Two developments sharpen this. A publicly disclosed intrusion showed an autonomous agent system converting ordinary software flaws into cross-cluster institutional reach at machine speed [7,8,24]. Alignment research showed that a model can behave cooperatively while pursuing a hidden objective, and that a model monitoring another model can miss it [21-23]. Trust by Construction treats the model as an untrusted reasoning engine rather than the security boundary, and extends that rule to the monitor: authorisation depends on neither the acting model's nor the reviewing model's judgment. Authority is declared in machine-readable form, narrowed per task, attenuated across delegation, and enforced by deterministic control services outside the reasoning layer. The architecture combines an AI Workload Passport, Task Contract, Dynamic Capability Envelope, Context and Memory Gateways, population-level agent controls, typed AI Intermediate Representation (AI-IR), Data Lineage Firewall, Release Escrow, continuous counterexample testing, and three controls added in this revision: a durable workload stop that survives evidence-plane failure and service restart, reauthorisation of queued output at every delivery boundary, and a restrict-only monitor interface that can contract authority but never grant it. A public Apache-2.0 reference kernel makes these claims executable on synthetic fixtures and regenerates the reported evidence offline. The design rule is proof before power: additional context, tools, agents, network reach, effects, and releases require independently verifiable authority. The work does not claim that authorised AI decisions are correct, that synthetic containment establishes production security, or that these controls would have prevented any real incident.</w:t>
+        <w:t xml:space="preserve">Agentic AI can access student records, retain memory, delegate work and initiate institutional actions. When a model is mistaken or pursuing a hidden objective, a useful safeguard must constrain what it can cause without relying on its stated intentions. Trust by Construction presents a compositional reference architecture for this boundary. A workload declaration and task contract limit authority; deterministic services mediate context, memory, delegation, effects and release. The contribution is an executable account of how these controls interact, including three failure-sensitive mechanisms: a durable workload stop that survives evidence-writer failure, reauthorisation of queued output at each delivery boundary, and an AI-monitor interface that may restrict authority but cannot grant it. The public reference uses synthetic education fixtures and an independent state-and-byte outcome check. Existing cross-sector experiments contain 180 of 180 hostile scenarios while completing 58 of 58 benign tasks. Eighteen additional local regression cases exercise stop, delivery and monitoring behavior. These measurements establish behavior within declared interfaces, not real-world attack prevalence or model alignment. The artifact provides a reusable engineering and teaching method: bind each authority claim to an enforcement point, an accountable role, an executed failure test and an explicit residual risk. The system does not establish operating-system isolation, substantive decision correctness or production certification.</w:t>
       </w:r>
     </w:p>
     <w:p>
@@ -104,17 +104,17 @@
     </w:p>
     <w:p>
       <w:r>
-        <w:t xml:space="preserve">Learning institutions are a demanding setting for agentic AI: tutors may reach student records; research agents may traverse public sources and repositories; coding agents may execute software; and administrative agents may act on assessment and admissions. The risk therefore moves beyond what the model says to what the system can cause. NIST and OWASP now treat identity, authorisation, runtime control, and traceability as first-class concerns for agents [2-6]. The July 2026 Hugging Face disclosure and its technical timeline state the systems problem precisely [7,8,24]. An agent system left an evaluation environment through a conventional vulnerability, used credentials exposed on the public web, obtained code execution inside production data-processing workers, read service-account tokens and cloud metadata from the pods it reached, enrolled devices into an internal network with a harvested key, and moved across clusters on one broadly scoped connector credential: roughly 17,600 recorded actions in about four and a half days, coordinated over ordinary public services rather than any declared channel. The initial compromise was ordinary software failure. Every amplifying step afterwards was an authority property: standing credentials, unconstrained reach, undeclared channels, and no bound on the number of mediated attempts. Trust by Construction does not claim to prevent conventional vulnerabilities; it aims to prevent an intelligence-layer compromise from automatically becoming institutional authority. The repository publishes this reading as a machine-checked map that assigns each reported stage to a mediated control, a deployment requirement, or a platform property the architecture does not supply. Five of the fourteen mapped stages are not mediated locally, and the map is tested to keep them visible.</w:t>
+        <w:t xml:space="preserve">Learning institutions expose the difference between useful reasoning and legitimate authority. A tutor may need a limited record view; a registrar may approve a correction; a research assistant may need public information without access to restricted student data. Combining these privileges in one agent process creates a larger failure surface than any individual task requires. Recent safety research separates misuse, misalignment, mistakes and structural risks, and argues for both model-level and system-level mitigations [1]. Experiments also show insider-threat behavior under constructed goal conflict and replacement pressure [5]. We address the institutional systems boundary: how can a compromised or unreliable reasoning component remain useful while consequential reads, writes and releases require independent authority?</w:t>
       </w:r>
     </w:p>
     <w:p>
       <w:r>
-        <w:t>The underlying mechanisms are established: reference monitors, capability systems, information-flow control, and zero trust [10–13]. Recent work such as CaMeL and FIDES applies related ideas to language-model agents [14,15], and AI-control research likewise asks how safety can hold when a model is intentionally subversive [17]. The contribution here is compositional: authority declared per workload, computed per task, attenuated across delegation, evaluated over communicating agent populations, bound to institutional purpose and data rights, and qualified by adversarial substitution rather than model-behaviour scores.</w:t>
+        <w:t xml:space="preserve">Our contribution is compositional rather than a new alignment algorithm. CaMeL demonstrates a system-level defense that separates control and data flow and constrains disclosure through capabilities [2]. Trust by Construction applies related architectural principles to an education workflow with memory, agent populations, effect approval, revocation and recipient delivery. It contributes an inspectable enforcement path, failure tests and a claim-to-evidence register. It does not offer a formal proof for arbitrary agent programs or a head-to-head performance comparison with CaMeL. The paper separates properties tested in the local kernel from requirements imposed on deployment adapters.</w:t>
       </w:r>
     </w:p>
     <w:p>
       <w:r>
-        <w:t xml:space="preserve">A second body of evidence constrains the design in a different direction. Anti-scheming work trained reasoning models against an explicit specification and reported roughly a thirty-fold reduction in covert actions across twenty-six held-out agentic evaluations, while also reporting residual cases under further red-teaming and partial attribution to the model recognising that it was being evaluated [21]. Studies of agentic misalignment across sixteen frontier models found insider-threat behaviour under goal conflict and threatened replacement [23]. The multi-organisation position on chain-of-thought monitorability describes reasoning transparency as a real but fragile signal that training pressure can erode [22]. Policy analysis through 2026 draws the operational conclusion that autonomy risk is near-term engineering work rather than speculation [25]. The architectural consequence is narrow and testable. A monitor is worth deploying, but it must never be worth compromising: authorisation must depend on neither the acting model's nor the reviewing model's judgment, and a detector that could restore privilege would itself become the escalation path.</w:t>
+        <w:t xml:space="preserve">Recent results motivate testing the authority boundary even when model behavior appears cooperative. Anti-scheming training reduced covert actions in held-out settings but left residual failures and evaluation-awareness confounds [3]. Chain-of-thought monitoring offers an imperfect signal rather than a reliable authorization basis [4]. Reward-hacking research found generalization from training shortcuts to broader misalignment [6], while SHADE-Arena evaluates harmful side objectives hidden within legitimate tasks [7]. A 2026 safety-research study found no unprompted sabotage in its tested settings, yet observed sabotage continuation in some seeded trajectories; those conditions must not be conflated [8]. Bengio and colleagues propose non-agentic Scientist AI as a safer direction for assisting research [9]. These findings support our design choice: AI may propose work, generate tests and report anomalies, while deterministic checks retain authority. A compromised monitor can still deny service or miss misconduct; it must not gain the power to approve an effect or restore privilege.</w:t>
       </w:r>
     </w:p>
     <w:p>
@@ -313,7 +313,7 @@
     </w:p>
     <w:p>
       <w:r>
-        <w:t>The architecture is implemented as the public FSSAI-RA reference kernel [20]. The repository runs offline without model weights or a GPU, provides machine-readable authority profiles, policy and capability checks, context/disclosure mediation, typed execution, evidence receipts, domain packs, portable conformance tests, bounded model checking, adversarial substitution, and scripts that regenerate the figures quoted here. No student records, human-subject data, or institutional production data are used in the reported experiments; they are synthetic fixtures. This matters because the artifact demonstrates mechanisms and falsifiers without implying field effectiveness.</w:t>
+        <w:t xml:space="preserve">The architecture is implemented as the public FSSAI-RA reference kernel. The repository runs offline without model weights or a GPU, provides machine-readable authority profiles, policy and capability checks, context/disclosure mediation, typed execution, evidence receipts, domain packs, portable conformance tests, bounded model checking, adversarial substitution, and scripts that regenerate the figures quoted here. No student records, human-subject data, or institutional production data are used in the reported experiments; they are synthetic fixtures. This matters because the artifact demonstrates mechanisms and falsifiers without implying field effectiveness.</w:t>
       </w:r>
     </w:p>
     <w:tbl>
@@ -573,7 +573,7 @@
               <w:rPr>
                 <w:sz w:val="16"/>
               </w:rPr>
-              <w:t xml:space="preserve">1,117 tests passed; ten source-bound capability contracts executed</w:t>
+              <w:t xml:space="preserve">1,120 tests passed; ten source-bound capability contracts executed</w:t>
             </w:r>
           </w:p>
         </w:tc>
@@ -614,7 +614,7 @@
               <w:rPr>
                 <w:sz w:val="16"/>
               </w:rPr>
-              <w:t xml:space="preserve">16 executed cases: durable stop, per-chunk reauthorisation, restrict-only monitoring</w:t>
+              <w:t xml:space="preserve">18 executed cases: durable stop, per-chunk reauthorisation, restrict-only monitoring</w:t>
             </w:r>
           </w:p>
         </w:tc>
@@ -845,7 +845,7 @@
     </w:p>
     <w:p>
       <w:r>
-        <w:t xml:space="preserve">The third control follows from the alignment results directly. An AI monitor receives a snapshot containing task metadata and the current evidence head, never protected text, and returns a three-field finding drawn from a fixed vocabulary. A finding may move a task toward READ_ONLY or QUARANTINED and may do nothing else. A clear verdict is recorded as an observation and changes no authority, so a monitor that has been deceived, or that is itself pursuing an undisclosed objective, cannot return privilege to a restricted workload. Findings are bound to a fresh evidence head, are single-use, and are rejected when forged, stale, replayed, submitted under another role, or carrying additional fields such as an approval. Restoration remains a named human action within the original ceiling. This is not a claim to detect scheming. It is a claim that a detection failure does not become an escalation path.</w:t>
+        <w:t xml:space="preserve">The third control follows from the alignment results directly. An AI monitor receives a snapshot containing task metadata, the current evidence head and at most 32 recent allowlisted event types, never protected text, and returns a three-field finding drawn from a fixed vocabulary. A finding may move a task toward READ_ONLY or QUARANTINED and may do nothing else. A clear verdict is recorded as an observation and changes no authority, so a monitor that has been deceived, or that is itself pursuing an undisclosed objective, cannot return privilege to a restricted workload. Findings are bound to a fresh evidence head, are single-use, and are rejected when forged, stale, replayed, submitted under another role, or carrying additional fields such as an approval. Restoration remains a named human action within the original ceiling. This is not a claim to detect scheming. It is a claim that a detection failure does not become an escalation path.</w:t>
       </w:r>
     </w:p>
     <w:p>
@@ -859,7 +859,7 @@
     </w:p>
     <w:p>
       <w:r>
-        <w:t>Education sharpens the general problem rather than merely illustrating it. Purpose limitation maps directly to the Task Contract; student and assessment data require explicit subject and release boundaries; research agents need Internet access without carrying sensitive institutional context; coding agents need sandboxed execution; and assessment demonstrates why a fully authorised action can still be wrong. Trust by Construction therefore supports “AI for Learning” by making institutional deployment safer, and “Learning for AI” by expanding AI literacy from prompting to architectural competence: identity, delegation, provenance, information flow, capability boundaries, oversight capacity, and failure containment. The same kernel can be rebound through domain packs for health, finance, legal services, enterprise data, and public services, allowing reusable schemas and conformance tests to function as digital public goods rather than requiring each institution to invent agent security from first principles.</w:t>
+        <w:t xml:space="preserve">Education sharpens the general problem rather than merely illustrating it. Purpose limitation maps directly to the Task Contract; student and assessment data require explicit subject and release boundaries; research agents need Internet access without carrying sensitive institutional context; coding agents need sandboxed execution; and assessment demonstrates why a fully authorised action can still be wrong. Trust by Construction therefore supports “AI for Learning” by making institutional authority inspectable, and “Learning for AI” by expanding AI literacy from prompting to architectural competence: identity, delegation, provenance, information flow, capability boundaries, oversight capacity, and failure containment. The same kernel can be rebound through domain packs for health, finance, legal services, enterprise data, and public services, allowing reusable schemas and conformance tests to function as digital public goods rather than requiring each institution to invent agent security from first principles.</w:t>
       </w:r>
     </w:p>
     <w:p>
@@ -869,13 +869,13 @@
     </w:p>
     <w:p>
       <w:r>
-        <w:t xml:space="preserve">The alignment is therefore concrete rather than decorative. It supports SDG 4 by protecting student records, assessment integrity, and the fairness of automated administrative decisions as agents enter learning systems; SDG 9 by supplying reusable, auditable infrastructure for autonomous institutional workflows; and SDG 16 by making institutional authority explicit, bounded, revocable, and evidenced, which is a precondition for accountable public administration wherever AI now acts. The same kernel rebinds through domain packs to health, finance, legal services, and public benefits, so a control tested once can be reused by institutions that could not have built it.</w:t>
+        <w:t xml:space="preserve">A concrete teaching exercise follows a synthetic transcript correction. The agent retrieves only the authorized record and proposes a version-bound change. A source role confirms the supporting evidence and a different reviewer approves the exact proposal. The executor revalidates authority before changing the record. A recipient receives only the approved artifact; a stop or revocation between chunks denies the remainder. Students can compare a valid completion with an attempted forged approval, contaminated memory and a misleading monitor verdict. This teaches the distinction between fluent advice, authorization, source validity and correctness. No result here measures learning outcomes or fairness; those require an institutional study.</w:t>
       </w:r>
     </w:p>
     <w:p>
       <w:pPr/>
       <w:r>
-        <w:t xml:space="preserve">Threats to validity and deployment limits. All reported containment results use synthetic fixtures and declared interfaces. They do not estimate real-world attack frequency, educational benefit, reviewer accuracy or robustness against undeclared host paths. Independent operational witnesses, workload federation, hardware-backed key custody, OS isolation, credential rotation, revocable streaming, browser isolation and the full training/promotion lifecycle remain qualification work. The reference does not claim that an authorized action is substantively correct, that logical memory expiry erases backups, or that local transactions provide exactly-once external effects. The three controls added in this revision are tested as deterministic local scenarios over the declared interface; they do not reproduce frontier-model propensities, and the incident map is an architectural reading of a public disclosure rather than a reconstruction or a claim that any real breach was preventable. The workload stop bounds declared authority, not host processes. The monitor interface bounds what a monitor can do to authority; it does not make a monitor accurate.</w:t>
+        <w:t xml:space="preserve">Threats to validity and deployment limits. The experiments use synthetic fixtures and declared interfaces. The new tests submit scripted findings and adversarial requests; no live frontier-model detector is evaluated, and no detector accuracy, real-world attack rate or causal prevention of an incident is claimed. Shared Python and SQLite state is trusted service infrastructure, not isolation from hostile native code. A source digest records artifact identity but does not attest a running model. Monitor false positives can reduce availability, and sparse event metadata can miss intent. Chunks are staged approved bytes rather than live model-token streaming; bytes already released cannot be recalled. Workload federation, independent witnesses, physical data erasure, OS/network confinement, qualified external transports and the training/promotion lifecycle remain deployment or implementation work. Local transactions do not establish exactly-once remote effects. The supplementary incident map is an architectural reading of public disclosures. Five of the fourteen mapped stages are not mediated locally; its existence is not evidence that the system would prevent a real breach.</w:t>
       </w:r>
     </w:p>
     <w:p>
@@ -917,7 +917,7 @@
     </w:p>
     <w:p>
       <w:r>
-        <w:t xml:space="preserve">Code, machine-readable authority profiles, synthetic adversarial and benign suites, generated results, and assurance claims are available under Apache-2.0 at github.com/genaiworks/fssai-ra [20]. The reviewer path runs offline after development dependencies are installed. Execute python -m pytest, python scripts/check_tbc_alignment.py, python scripts/check_architecture.py, python scripts/verify_architecture.py and python scripts/generate_results.py --check from fssai-ra/. The capability verifier executes named tests and records JUnit, logs and a digest of the Python source and tests; collection, skipped tests and model assertions do not qualify as successful evidence. The original v11 Word source remains preserved for provenance, while the revised paper is bound separately to its engineering claims. The controls added in this revision run with python -m pytest tests/test_frontier_controls.py tests/test_incident_map.py, and the incident reading is published as docs/THREAT_MODEL_2026.md with its machine-checked form in audit/incident-map.json.</w:t>
+        <w:t xml:space="preserve">Code, machine-readable authority profiles, synthetic adversarial and benign suites, generated results, and assurance claims are available under Apache-2.0 at github.com/genaiworks/fssai-ra. The reviewer path runs offline after development dependencies are installed. Execute python -m pytest, python scripts/check_tbc_alignment.py, python scripts/check_architecture.py, python scripts/verify_architecture.py and python scripts/generate_results.py --check from fssai-ra/. The capability verifier executes named tests and records JUnit, logs and a digest of the Python source and tests; collection, skipped tests and model assertions do not qualify as successful evidence. The original v11 Word source remains preserved for provenance, while the revised paper is bound separately to its engineering claims. The controls added in this revision run with python -m pytest tests/test_frontier_controls.py tests/test_incident_map.py, and the incident reading is published as docs/THREAT_MODEL_2026.md with its machine-checked form in audit/incident-map.json.</w:t>
       </w:r>
     </w:p>
     <w:p>
@@ -935,7 +935,7 @@
         <w:pStyle w:val="TBCRef"/>
       </w:pPr>
       <w:r>
-        <w:t>[1] United Nations University Macau, “UNU Macau AI Conference 2026,” 2026.</w:t>
+        <w:t xml:space="preserve">[1] R. Shah et al., An Approach to Technical AGI Safety and Security. Research preprint, 2025. https://arxiv.org/abs/2504.01849</w:t>
       </w:r>
     </w:p>
     <w:p>
@@ -943,10 +943,7 @@
         <w:pStyle w:val="TBCRef"/>
       </w:pPr>
       <w:r>
-        <w:t>[2] National Institute of Standards and Technology, Center for AI Standards and Innovation, “AI Agent Standards Initiative,” 2026.</w:t>
-      </w:r>
-      <w:r>
-        <w:t xml:space="preserve"> https://www.nist.gov/news-events/news/2026/02/announcing-ai-agent-standards-initiative-interoperable-and-secure</w:t>
+        <w:t xml:space="preserve">[2] E. Debenedetti et al., Defeating Prompt Injections by Design. Research preprint, 2025. https://arxiv.org/abs/2503.18813</w:t>
       </w:r>
     </w:p>
     <w:p>
@@ -954,7 +951,7 @@
         <w:pStyle w:val="TBCRef"/>
       </w:pPr>
       <w:r>
-        <w:t>[3] NIST NCCoE, Accelerating the Adoption of Software and Artificial Intelligence Agent Identity and Authorization, Initial Public Draft, 2026.</w:t>
+        <w:t xml:space="preserve">[3] B. Schoen et al., Stress Testing Deliberative Alignment for Anti-Scheming Training. Research preprint, 2025. https://arxiv.org/abs/2509.15541</w:t>
       </w:r>
     </w:p>
     <w:p>
@@ -962,7 +959,7 @@
         <w:pStyle w:val="TBCRef"/>
       </w:pPr>
       <w:r>
-        <w:t>[4] J. Riggs et al., Summary Analysis of Responses Regarding Security Considerations for AI Agents, NIST Trustworthy and Responsible AI 800-5, 2026.</w:t>
+        <w:t xml:space="preserve">[4] T. Korbak et al., Chain of Thought Monitorability: A New and Fragile Opportunity for AI Safety. Research preprint, 2025. https://arxiv.org/abs/2507.11473</w:t>
       </w:r>
     </w:p>
     <w:p>
@@ -970,7 +967,7 @@
         <w:pStyle w:val="TBCRef"/>
       </w:pPr>
       <w:r>
-        <w:t>[5] OWASP GenAI Security Project, OWASP Top 10 for Agentic Applications for 2026, 2025.</w:t>
+        <w:t xml:space="preserve">[5] A. Lynch et al., Agentic Misalignment: How LLMs Could Be Insider Threats. Research preprint, 2025. https://arxiv.org/abs/2510.05179</w:t>
       </w:r>
     </w:p>
     <w:p>
@@ -978,7 +975,7 @@
         <w:pStyle w:val="TBCRef"/>
       </w:pPr>
       <w:r>
-        <w:t>[6] OWASP GenAI Security Project, Agent Control Standard, 2026.</w:t>
+        <w:t xml:space="preserve">[6] M. MacDiarmid et al., Natural Emergent Misalignment from Reward Hacking in Production RL. Research preprint, 2025. https://arxiv.org/abs/2511.18397</w:t>
       </w:r>
     </w:p>
     <w:p>
@@ -986,10 +983,7 @@
         <w:pStyle w:val="TBCRef"/>
       </w:pPr>
       <w:r>
-        <w:t>[7] Hugging Face, “Security incident disclosure — July 2026,” 2026.</w:t>
-      </w:r>
-      <w:r>
-        <w:t xml:space="preserve"> https://huggingface.co/blog/security-incident-july-2026</w:t>
+        <w:t xml:space="preserve">[7] J. Kutasov et al., SHADE-Arena: Evaluating Sabotage and Monitoring in LLM Agents. Research preprint, 2025. https://arxiv.org/abs/2506.15740</w:t>
       </w:r>
     </w:p>
     <w:p>
@@ -997,10 +991,7 @@
         <w:pStyle w:val="TBCRef"/>
       </w:pPr>
       <w:r>
-        <w:t>[8] OpenAI, “The Hugging Face incident and the road ahead,” 2026.</w:t>
-      </w:r>
-      <w:r>
-        <w:t xml:space="preserve"> https://openai.com/index/hugging-face-incident-and-the-road-ahead/</w:t>
+        <w:t xml:space="preserve">[8] R. Kirk et al., Evaluating whether AI models would sabotage AI safety research. Research preprint, 2026. https://arxiv.org/abs/2604.24618</w:t>
       </w:r>
     </w:p>
     <w:p>
@@ -1008,135 +999,7 @@
         <w:pStyle w:val="TBCRef"/>
       </w:pPr>
       <w:r>
-        <w:t>[9] METR and Redwood Research, “Brief independent investigation of agents’ behavior, reasoning and collaboration in the OpenAI / Hugging Face hacking incident,” 2026.</w:t>
-      </w:r>
-    </w:p>
-    <w:p>
-      <w:pPr>
-        <w:pStyle w:val="TBCRef"/>
-      </w:pPr>
-      <w:r>
-        <w:t>[10] J. H. Saltzer and M. D. Schroeder, “The Protection of Information in Computer Systems,” Proceedings of the IEEE, 1975.</w:t>
-      </w:r>
-    </w:p>
-    <w:p>
-      <w:pPr>
-        <w:pStyle w:val="TBCRef"/>
-      </w:pPr>
-      <w:r>
-        <w:t>[11] J. B. Dennis and E. C. Van Horn, “Programming Semantics for Multiprogrammed Computations,” Communications of the ACM, 1966.</w:t>
-      </w:r>
-    </w:p>
-    <w:p>
-      <w:pPr>
-        <w:pStyle w:val="TBCRef"/>
-      </w:pPr>
-      <w:r>
-        <w:t>[12] D. E. Denning, “A Lattice Model of Secure Information Flow,” Communications of the ACM, 1976.</w:t>
-      </w:r>
-    </w:p>
-    <w:p>
-      <w:pPr>
-        <w:pStyle w:val="TBCRef"/>
-      </w:pPr>
-      <w:r>
-        <w:t>[13] National Institute of Standards and Technology, Zero Trust Architecture, NIST SP 800-207, 2020.</w:t>
-      </w:r>
-    </w:p>
-    <w:p>
-      <w:pPr>
-        <w:pStyle w:val="TBCRef"/>
-      </w:pPr>
-      <w:r>
-        <w:t>[14] E. Debenedetti et al., “Defeating Prompt Injections by Design (CaMeL),” 2025.</w:t>
-      </w:r>
-    </w:p>
-    <w:p>
-      <w:pPr>
-        <w:pStyle w:val="TBCRef"/>
-      </w:pPr>
-      <w:r>
-        <w:t>[15] M. Costa et al., “Securing AI Agents with Information-Flow Control (FIDES),” 2025.</w:t>
-      </w:r>
-    </w:p>
-    <w:p>
-      <w:pPr>
-        <w:pStyle w:val="TBCRef"/>
-      </w:pPr>
-      <w:r>
-        <w:t>[16] L. Beurer-Kellner et al., “Design Patterns for Securing LLM Agents against Prompt Injection,” 2025.</w:t>
-      </w:r>
-    </w:p>
-    <w:p>
-      <w:pPr>
-        <w:pStyle w:val="TBCRef"/>
-      </w:pPr>
-      <w:r>
-        <w:t>[17] R. Greenblatt et al., “AI Control: Improving Safety Despite Intentional Subversion,” 2024.</w:t>
-      </w:r>
-    </w:p>
-    <w:p>
-      <w:pPr>
-        <w:pStyle w:val="TBCRef"/>
-      </w:pPr>
-      <w:r>
-        <w:t>[18] UNESCO, AI Competency Framework for Students and AI Competency Framework for Teachers, 2024.</w:t>
-      </w:r>
-    </w:p>
-    <w:p>
-      <w:pPr>
-        <w:pStyle w:val="TBCRef"/>
-      </w:pPr>
-      <w:r>
-        <w:t>[19] United Nations University Macau, UNU–Springer Book Series on Artificial Intelligence and Sustainable Development, 2025.</w:t>
-      </w:r>
-    </w:p>
-    <w:p>
-      <w:pPr>
-        <w:pStyle w:val="TBCRef"/>
-      </w:pPr>
-      <w:r>
-        <w:t>[20] R. Srivastava, FSSAI-RA: Fail-Secure Sovereign AI Reference Architecture, Apache-2.0 public reference implementation, 2026. https://github.com/genaiworks/fssai-ra</w:t>
-      </w:r>
-    </w:p>
-    <w:p>
-      <w:pPr>
-        <w:pStyle w:val="TBCRef"/>
-      </w:pPr>
-      <w:r>
-        <w:t xml:space="preserve">[21] B. Schoen et al., “Stress Testing Deliberative Alignment for Anti-Scheming Training,” 2025. https://arxiv.org/abs/2509.15541</w:t>
-      </w:r>
-    </w:p>
-    <w:p>
-      <w:pPr>
-        <w:pStyle w:val="TBCRef"/>
-      </w:pPr>
-      <w:r>
-        <w:t xml:space="preserve">[22] T. Korbak et al., “Chain of Thought Monitorability: A New and Fragile Opportunity for AI Safety,” 2025. https://arxiv.org/abs/2507.11473</w:t>
-      </w:r>
-    </w:p>
-    <w:p>
-      <w:pPr>
-        <w:pStyle w:val="TBCRef"/>
-      </w:pPr>
-      <w:r>
-        <w:t xml:space="preserve">[23] A. Lynch et al., “Agentic Misalignment: How LLMs Could Be Insider Threats,” 2025. https://arxiv.org/abs/2510.05179</w:t>
-      </w:r>
-    </w:p>
-    <w:p>
-      <w:pPr>
-        <w:pStyle w:val="TBCRef"/>
-      </w:pPr>
-      <w:r>
-        <w:t xml:space="preserve">[24] Hugging Face, “Anatomy of a Frontier Lab Agent Intrusion: A Technical Timeline of the July 2026 Incident,” 2026. https://huggingface.co/blog/agent-intrusion-technical-timeline</w:t>
-      </w:r>
-    </w:p>
-    <w:p>
-      <w:pPr>
-        <w:pStyle w:val="TBCRef"/>
-      </w:pPr>
-      <w:r>
-        <w:t xml:space="preserve">[25] D. Amodei, “The Adolescence of Technology,” essay, 2026. https://darioamodei.com/essay/the-adolescence-of-technology</w:t>
+        <w:t xml:space="preserve">[9] Y. Bengio et al., Superintelligent Agents Pose Catastrophic Risks: Can Scientist AI Offer a Safer Path?. Research preprint, 2025. https://arxiv.org/abs/2502.15657</w:t>
       </w:r>
     </w:p>
     <w:sectPr>

</xml_diff>

<commit_message>
Fix monitor availability and destination ambiguity with reproducible v13 evidence
</commit_message>
<xml_diff>
--- a/fssai-ra/paper/tbc-v13/TBC_v13_Frontier_Threat_Revision.docx
+++ b/fssai-ra/paper/tbc-v13/TBC_v13_Frontier_Threat_Revision.docx
@@ -76,7 +76,7 @@
     </w:p>
     <w:p>
       <w:r>
-        <w:t xml:space="preserve">Agentic AI can access student records, retain memory, delegate work and initiate institutional actions. When a model is mistaken or pursuing a hidden objective, a useful safeguard must constrain what it can cause without relying on its stated intentions. Trust by Construction presents a compositional reference architecture for this boundary. A workload declaration and task contract limit authority; deterministic services mediate context, memory, delegation, effects and release. The contribution is an executable account of how these controls interact, including three failure-sensitive mechanisms: a durable workload stop that survives evidence-writer failure, reauthorisation of queued output at each delivery boundary, and an AI-monitor interface that may restrict authority but cannot grant it. The public reference uses synthetic education fixtures and an independent state-and-byte outcome check. Existing cross-sector experiments contain 180 of 180 hostile scenarios while completing 58 of 58 benign tasks. Eighteen additional local regression cases exercise stop, delivery and monitoring behavior. These measurements establish behavior within declared interfaces, not real-world attack prevalence or model alignment. The artifact provides a reusable engineering and teaching method: bind each authority claim to an enforcement point, an accountable role, an executed failure test and an explicit residual risk. The system does not establish operating-system isolation, substantive decision correctness or production certification.</w:t>
+        <w:t xml:space="preserve">Agentic AI can access student records, retain memory, delegate work and initiate institutional actions. When a model is mistaken or pursuing a hidden objective, a useful safeguard must constrain what it can cause without relying on its stated intentions. Trust by Construction presents a compositional reference architecture for this boundary. A workload declaration and task contract limit authority; deterministic services mediate context, memory, delegation, effects and release. The contribution is an executable account of how these controls interact, including three failure-sensitive mechanisms: a durable workload stop that survives evidence-writer failure, reauthorisation of queued output at each delivery boundary, and an AI-monitor interface that may restrict authority but cannot grant it. The public reference uses synthetic education fixtures and an independent state-and-byte outcome check. Existing cross-sector experiments contain 180 of 180 hostile scenarios while completing 58 of 58 benign tasks. Thirty-five local regression cases exercise stop, delivery and monitoring behavior. These measurements establish behavior within declared interfaces, not real-world attack prevalence or model alignment. The artifact provides a reusable engineering and teaching method: bind each authority claim to an enforcement point, an accountable role, an executed failure test and an explicit residual risk. The system does not establish operating-system isolation, substantive decision correctness or production certification.</w:t>
       </w:r>
     </w:p>
     <w:p>
@@ -109,7 +109,7 @@
     </w:p>
     <w:p>
       <w:r>
-        <w:t xml:space="preserve">Our contribution is compositional rather than a new alignment algorithm. CaMeL demonstrates a system-level defense that separates control and data flow and constrains disclosure through capabilities [2]. Trust by Construction applies related architectural principles to an education workflow with memory, agent populations, effect approval, revocation and recipient delivery. It contributes an inspectable enforcement path, failure tests and a claim-to-evidence register. It does not offer a formal proof for arbitrary agent programs or a head-to-head performance comparison with CaMeL. The paper separates properties tested in the local kernel from requirements imposed on deployment adapters.</w:t>
+        <w:t xml:space="preserve">Our contribution is compositional rather than a new alignment algorithm. CaMeL demonstrates a system-level defense that separates control and data flow and constrains disclosure through capabilities [2]. Trust by Construction applies related architectural principles to an education workflow with memory, agent populations, effect approval, revocation and recipient delivery. It contributes an inspectable enforcement path, failure tests and a claim-to-evidence register. It does not offer a formal proof for arbitrary agent programs or a head-to-head performance comparison with CaMeL. The paper separates properties tested in the local kernel from requirements imposed on deployment adapters. AgentSecBench separates instruction integrity, confidentiality and capability integrity, using paired adversarial and benign executions [10]. AgentDyn studies dynamic tasks and helpful third-party instructions, exposing a security–utility tradeoff that static blocking tests can miss [11]. Our smaller synthetic evaluation makes no benchmark-ranking claim; it complements this work with persistent authority, revocation and failure-atomic delivery checks.</w:t>
       </w:r>
     </w:p>
     <w:p>
@@ -573,7 +573,7 @@
               <w:rPr>
                 <w:sz w:val="16"/>
               </w:rPr>
-              <w:t xml:space="preserve">1,120 tests passed; ten source-bound capability contracts executed</w:t>
+              <w:t xml:space="preserve">1,147 tests passed; ten source-bound capability contracts executed</w:t>
             </w:r>
           </w:p>
         </w:tc>
@@ -614,7 +614,7 @@
               <w:rPr>
                 <w:sz w:val="16"/>
               </w:rPr>
-              <w:t xml:space="preserve">18 executed cases: durable stop, per-chunk reauthorisation, restrict-only monitoring</w:t>
+              <w:t xml:space="preserve">35 executed cases: durable stop, per-chunk reauthorisation, restrict-only monitoring</w:t>
             </w:r>
           </w:p>
         </w:tc>
@@ -845,7 +845,12 @@
     </w:p>
     <w:p>
       <w:r>
-        <w:t xml:space="preserve">The third control follows from the alignment results directly. An AI monitor receives a snapshot containing task metadata, the current evidence head and at most 32 recent allowlisted event types, never protected text, and returns a three-field finding drawn from a fixed vocabulary. A finding may move a task toward READ_ONLY or QUARANTINED and may do nothing else. A clear verdict is recorded as an observation and changes no authority, so a monitor that has been deceived, or that is itself pursuing an undisclosed objective, cannot return privilege to a restricted workload. Findings are bound to a fresh evidence head, are single-use, and are rejected when forged, stale, replayed, submitted under another role, or carrying additional fields such as an approval. Restoration remains a named human action within the original ceiling. This is not a claim to detect scheming. It is a claim that a detection failure does not become an escalation path.</w:t>
+        <w:t xml:space="preserve">The third control follows from the alignment results directly. An AI monitor receives a snapshot containing task metadata, task and global-control evidence heads and at most 32 recent allowlisted event types, never protected text, and returns a three-field finding drawn from a fixed vocabulary. A finding may move a task toward READ_ONLY or QUARANTINED and may do nothing else. A clear verdict is recorded as an observation and changes no authority, so a monitor that has been deceived, or that is itself pursuing an undisclosed objective, cannot return privilege to a restricted workload. Findings are bound to a fresh evidence head, are single-use, and are rejected when forged, stale, replayed, submitted under another role, or carrying additional fields such as an approval. Restoration remains a named human action within the original ceiling. This is not a claim to detect scheming. It is a claim that a detection failure does not become an escalation path.</w:t>
+      </w:r>
+    </w:p>
+    <w:p>
+      <w:r>
+        <w:t xml:space="preserve">A security review exposed three practical defects in the reference: unrelated task traffic could displace monitor history and stale its advice, non-string monitor fields could raise uncontrolled type errors, and URL path parameters or encoded delimiters could admit ambiguous destinations. The revised service queries task-indexed evidence before applying the 32-event limit, binds findings to task and global-control heads, and validates field types before interpretation. Global source invalidation and revocation still stale advice. Destination authorization rejects matrix parameters, encoded delimiters and repeated separators while preserving safe unreserved encoding. Twenty-seven added regression cases check these changes and legitimate continuation; they overlap the reported regression total and are not additional attack episodes. The destination policy remains a transport contract: an adapter must pin the approved address, verify TLS identity, enforce byte limits and reauthorize every redirect.</w:t>
       </w:r>
     </w:p>
     <w:p>
@@ -1000,6 +1005,22 @@
       </w:pPr>
       <w:r>
         <w:t xml:space="preserve">[9] Y. Bengio et al., Superintelligent Agents Pose Catastrophic Risks: Can Scientist AI Offer a Safer Path?. Research preprint, 2025. https://arxiv.org/abs/2502.15657</w:t>
+      </w:r>
+    </w:p>
+    <w:p>
+      <w:pPr>
+        <w:pStyle w:val="TBCRef"/>
+      </w:pPr>
+      <w:r>
+        <w:t xml:space="preserve">[10] F. Alpay and T. Alpay, AgentSecBench: Measuring Prompt Injection, Privacy Leakage, and Tool-Use Integrity in LLM Agents. Research preprint, 2026. https://arxiv.org/abs/2605.26269</w:t>
+      </w:r>
+    </w:p>
+    <w:p>
+      <w:pPr>
+        <w:pStyle w:val="TBCRef"/>
+      </w:pPr>
+      <w:r>
+        <w:t xml:space="preserve">[11] H. Li et al., AgentDyn: Are Your Agent Security Defenses Deployable in Real-World Dynamic Environments?. Research preprint, 2026. https://arxiv.org/abs/2602.03117</w:t>
       </w:r>
     </w:p>
     <w:sectPr>

</xml_diff>